<commit_message>
Fix Vercel routing for bios page
</commit_message>
<xml_diff>
--- a/About Alan Wong.docx
+++ b/About Alan Wong.docx
@@ -29,7 +29,23 @@
           <w:b/>
           <w:bCs/>
         </w:rPr>
-        <w:t>MSc, BEd, CSCS, USAW, CPT</w:t>
+        <w:t xml:space="preserve">MSc, </w:t>
+      </w:r>
+      <w:proofErr w:type="spellStart"/>
+      <w:r>
+        <w:rPr>
+          <w:b/>
+          <w:bCs/>
+        </w:rPr>
+        <w:t>BEd</w:t>
+      </w:r>
+      <w:proofErr w:type="spellEnd"/>
+      <w:r>
+        <w:rPr>
+          <w:b/>
+          <w:bCs/>
+        </w:rPr>
+        <w:t>, CSCS, USAW, CPT</w:t>
       </w:r>
     </w:p>
     <w:p>
@@ -102,7 +118,15 @@
     </w:p>
     <w:p>
       <w:r>
-        <w:t>Alan’s professional background is uncommon because it spans multiple worlds: coaching athletes, teaching university students, designing sport education curricula, supporting clinical exercise programmes, advising sport organisations, and now training toward a future career in physiotherapy.</w:t>
+        <w:t xml:space="preserve">Alan’s professional background is uncommon because it spans multiple worlds: coaching athletes, teaching university students, designing sport education curricula, supporting clinical exercise programmes, advising sport </w:t>
+      </w:r>
+      <w:proofErr w:type="spellStart"/>
+      <w:r>
+        <w:t>organisations</w:t>
+      </w:r>
+      <w:proofErr w:type="spellEnd"/>
+      <w:r>
+        <w:t>, and now training toward a future career in physiotherapy.</w:t>
       </w:r>
     </w:p>
     <w:p/>
@@ -126,7 +150,15 @@
         <w:t xml:space="preserve">Alan’s coaching philosophy </w:t>
       </w:r>
       <w:r>
-        <w:t xml:space="preserve">can be summarised into 3S – </w:t>
+        <w:t xml:space="preserve">can be </w:t>
+      </w:r>
+      <w:proofErr w:type="spellStart"/>
+      <w:r>
+        <w:t>summarised</w:t>
+      </w:r>
+      <w:proofErr w:type="spellEnd"/>
+      <w:r>
+        <w:t xml:space="preserve"> into 3S – </w:t>
       </w:r>
       <w:r>
         <w:rPr>
@@ -169,12 +201,21 @@
       <w:r>
         <w:t xml:space="preserve">e oversaw technical operations across the </w:t>
       </w:r>
-      <w:r>
-        <w:rPr>
-          <w:b/>
-          <w:bCs/>
-        </w:rPr>
-        <w:t>High Performance Centre</w:t>
+      <w:proofErr w:type="gramStart"/>
+      <w:r>
+        <w:rPr>
+          <w:b/>
+          <w:bCs/>
+        </w:rPr>
+        <w:t>High Performance</w:t>
+      </w:r>
+      <w:proofErr w:type="gramEnd"/>
+      <w:r>
+        <w:rPr>
+          <w:b/>
+          <w:bCs/>
+        </w:rPr>
+        <w:t xml:space="preserve"> Centre</w:t>
       </w:r>
       <w:r>
         <w:t xml:space="preserve">, </w:t>
@@ -290,7 +331,15 @@
     </w:p>
     <w:p>
       <w:r>
-        <w:t xml:space="preserve">Alan’s teaching career has been recognised through major university awards, including the </w:t>
+        <w:t xml:space="preserve">Alan’s teaching career has been </w:t>
+      </w:r>
+      <w:proofErr w:type="spellStart"/>
+      <w:r>
+        <w:t>recognised</w:t>
+      </w:r>
+      <w:proofErr w:type="spellEnd"/>
+      <w:r>
+        <w:t xml:space="preserve"> through major university awards, including the </w:t>
       </w:r>
       <w:r>
         <w:rPr>
@@ -331,7 +380,15 @@
     </w:p>
     <w:p>
       <w:r>
-        <w:t>Alan has contributed to sport development, coach education, and organisational advisory work across Hong Kong’s sport sector.</w:t>
+        <w:t xml:space="preserve">Alan has contributed to sport development, coach education, and </w:t>
+      </w:r>
+      <w:proofErr w:type="spellStart"/>
+      <w:r>
+        <w:t>organisational</w:t>
+      </w:r>
+      <w:proofErr w:type="spellEnd"/>
+      <w:r>
+        <w:t xml:space="preserve"> advisory work across Hong Kong’s sport sector.</w:t>
       </w:r>
     </w:p>
     <w:p>
@@ -452,7 +509,15 @@
         <w:t xml:space="preserve"> </w:t>
       </w:r>
       <w:r>
-        <w:t xml:space="preserve">how organisations develop systems, </w:t>
+        <w:t xml:space="preserve">how </w:t>
+      </w:r>
+      <w:proofErr w:type="spellStart"/>
+      <w:r>
+        <w:t>organisations</w:t>
+      </w:r>
+      <w:proofErr w:type="spellEnd"/>
+      <w:r>
+        <w:t xml:space="preserve"> develop systems, </w:t>
       </w:r>
       <w:r>
         <w:t>how people learn</w:t>
@@ -637,8 +702,13 @@
           <w:numId w:val="5"/>
         </w:numPr>
       </w:pPr>
-      <w:r>
-        <w:t>PEDro rater training</w:t>
+      <w:proofErr w:type="spellStart"/>
+      <w:r>
+        <w:t>PEDro</w:t>
+      </w:r>
+      <w:proofErr w:type="spellEnd"/>
+      <w:r>
+        <w:t xml:space="preserve"> rater training</w:t>
       </w:r>
       <w:r>
         <w:t xml:space="preserve"> </w:t>
@@ -716,173 +786,32 @@
     </w:p>
     <w:p>
       <w:r>
-        <w:t>Alan’s long-term aspiration is to integrate physiotherapy, strength and conditioning, education, and sport performance into a coherent professional practice. His goal is to help people train safely, and build long-term health before problems become serious.</w:t>
-      </w:r>
+        <w:t xml:space="preserve">Alan’s long-term aspiration is to integrate physiotherapy, strength and conditioning, education, and sport performance into a coherent professional practice. His goal is to help people train </w:t>
+      </w:r>
+      <w:proofErr w:type="gramStart"/>
+      <w:r>
+        <w:t>safely, and</w:t>
+      </w:r>
+      <w:proofErr w:type="gramEnd"/>
+      <w:r>
+        <w:t xml:space="preserve"> build long-term health before problems become serious.</w:t>
+      </w:r>
+    </w:p>
+    <w:p>
+      <w:pPr>
+        <w:rPr>
+          <w:rFonts w:ascii="Segoe UI Emoji" w:hAnsi="Segoe UI Emoji" w:cs="Segoe UI Emoji"/>
+        </w:rPr>
+      </w:pPr>
+    </w:p>
+    <w:p>
+      <w:pPr>
+        <w:rPr>
+          <w:rFonts w:ascii="Segoe UI Emoji" w:hAnsi="Segoe UI Emoji" w:cs="Segoe UI Emoji"/>
+        </w:rPr>
+      </w:pPr>
     </w:p>
     <w:p/>
-    <w:p>
-      <w:r>
-        <w:rPr>
-          <w:noProof/>
-        </w:rPr>
-        <w:drawing>
-          <wp:inline distT="0" distB="0" distL="0" distR="0" wp14:anchorId="7D38D73D" wp14:editId="34749624">
-            <wp:extent cx="914400" cy="914400"/>
-            <wp:effectExtent l="0" t="0" r="0" b="0"/>
-            <wp:docPr id="1320326750" name="Graphic 1" descr="Smiling face with solid fill with solid fill"/>
-            <wp:cNvGraphicFramePr>
-              <a:graphicFrameLocks xmlns:a="http://schemas.openxmlformats.org/drawingml/2006/main" noChangeAspect="1"/>
-            </wp:cNvGraphicFramePr>
-            <a:graphic xmlns:a="http://schemas.openxmlformats.org/drawingml/2006/main">
-              <a:graphicData uri="http://schemas.openxmlformats.org/drawingml/2006/picture">
-                <pic:pic xmlns:pic="http://schemas.openxmlformats.org/drawingml/2006/picture">
-                  <pic:nvPicPr>
-                    <pic:cNvPr id="1320326750" name="Graphic 1320326750" descr="Smiling face with solid fill with solid fill"/>
-                    <pic:cNvPicPr/>
-                  </pic:nvPicPr>
-                  <pic:blipFill>
-                    <a:blip r:embed="rId8">
-                      <a:extLst>
-                        <a:ext uri="{96DAC541-7B7A-43D3-8B79-37D633B846F1}">
-                          <asvg:svgBlip xmlns:asvg="http://schemas.microsoft.com/office/drawing/2016/SVG/main" r:embed="rId9"/>
-                        </a:ext>
-                      </a:extLst>
-                    </a:blip>
-                    <a:stretch>
-                      <a:fillRect/>
-                    </a:stretch>
-                  </pic:blipFill>
-                  <pic:spPr>
-                    <a:xfrm>
-                      <a:off x="0" y="0"/>
-                      <a:ext cx="914400" cy="914400"/>
-                    </a:xfrm>
-                    <a:prstGeom prst="rect">
-                      <a:avLst/>
-                    </a:prstGeom>
-                  </pic:spPr>
-                </pic:pic>
-              </a:graphicData>
-            </a:graphic>
-          </wp:inline>
-        </w:drawing>
-      </w:r>
-      <w:r>
-        <w:rPr>
-          <w:noProof/>
-        </w:rPr>
-        <w:drawing>
-          <wp:inline distT="0" distB="0" distL="0" distR="0" wp14:anchorId="2852A2D1" wp14:editId="74B72047">
-            <wp:extent cx="914400" cy="914400"/>
-            <wp:effectExtent l="0" t="0" r="0" b="0"/>
-            <wp:docPr id="39026299" name="Graphic 2" descr="Smiling face outline with solid fill"/>
-            <wp:cNvGraphicFramePr>
-              <a:graphicFrameLocks xmlns:a="http://schemas.openxmlformats.org/drawingml/2006/main" noChangeAspect="1"/>
-            </wp:cNvGraphicFramePr>
-            <a:graphic xmlns:a="http://schemas.openxmlformats.org/drawingml/2006/main">
-              <a:graphicData uri="http://schemas.openxmlformats.org/drawingml/2006/picture">
-                <pic:pic xmlns:pic="http://schemas.openxmlformats.org/drawingml/2006/picture">
-                  <pic:nvPicPr>
-                    <pic:cNvPr id="39026299" name="Graphic 39026299" descr="Smiling face outline with solid fill"/>
-                    <pic:cNvPicPr/>
-                  </pic:nvPicPr>
-                  <pic:blipFill>
-                    <a:blip r:embed="rId10">
-                      <a:extLst>
-                        <a:ext uri="{96DAC541-7B7A-43D3-8B79-37D633B846F1}">
-                          <asvg:svgBlip xmlns:asvg="http://schemas.microsoft.com/office/drawing/2016/SVG/main" r:embed="rId11"/>
-                        </a:ext>
-                      </a:extLst>
-                    </a:blip>
-                    <a:stretch>
-                      <a:fillRect/>
-                    </a:stretch>
-                  </pic:blipFill>
-                  <pic:spPr>
-                    <a:xfrm>
-                      <a:off x="0" y="0"/>
-                      <a:ext cx="914400" cy="914400"/>
-                    </a:xfrm>
-                    <a:prstGeom prst="rect">
-                      <a:avLst/>
-                    </a:prstGeom>
-                  </pic:spPr>
-                </pic:pic>
-              </a:graphicData>
-            </a:graphic>
-          </wp:inline>
-        </w:drawing>
-      </w:r>
-      <w:r>
-        <w:t xml:space="preserve"> </w:t>
-      </w:r>
-      <w:r>
-        <w:rPr>
-          <w:rFonts w:ascii="Segoe UI Emoji" w:hAnsi="Segoe UI Emoji" w:cs="Segoe UI Emoji"/>
-        </w:rPr>
-        <w:t>🙂</w:t>
-      </w:r>
-      <w:r>
-        <w:rPr>
-          <mc:AlternateContent>
-            <mc:Choice Requires="w16se">
-              <w:rFonts w:ascii="Segoe UI Emoji" w:hAnsi="Segoe UI Emoji" w:cs="Segoe UI Emoji"/>
-            </mc:Choice>
-            <mc:Fallback>
-              <w:rFonts w:ascii="Segoe UI Emoji" w:eastAsia="Segoe UI Emoji" w:hAnsi="Segoe UI Emoji" w:cs="Segoe UI Emoji"/>
-            </mc:Fallback>
-          </mc:AlternateContent>
-        </w:rPr>
-        <mc:AlternateContent>
-          <mc:Choice Requires="w16se">
-            <w16se:symEx w16se:font="Segoe UI Emoji" w16se:char="1F60A"/>
-          </mc:Choice>
-          <mc:Fallback>
-            <w:t>😊</w:t>
-          </mc:Fallback>
-        </mc:AlternateContent>
-      </w:r>
-      <w:r>
-        <w:rPr>
-          <mc:AlternateContent>
-            <mc:Choice Requires="w16se">
-              <w:rFonts w:ascii="Segoe UI Emoji" w:hAnsi="Segoe UI Emoji" w:cs="Segoe UI Emoji"/>
-            </mc:Choice>
-            <mc:Fallback>
-              <w:rFonts w:ascii="Segoe UI Emoji" w:eastAsia="Segoe UI Emoji" w:hAnsi="Segoe UI Emoji" w:cs="Segoe UI Emoji"/>
-            </mc:Fallback>
-          </mc:AlternateContent>
-        </w:rPr>
-        <mc:AlternateContent>
-          <mc:Choice Requires="w16se">
-            <w16se:symEx w16se:font="Segoe UI Emoji" w16se:char="1F60A"/>
-          </mc:Choice>
-          <mc:Fallback>
-            <w:t>😊</w:t>
-          </mc:Fallback>
-        </mc:AlternateContent>
-      </w:r>
-      <w:r>
-        <w:rPr>
-          <mc:AlternateContent>
-            <mc:Choice Requires="w16se">
-              <w:rFonts w:ascii="Segoe UI Emoji" w:hAnsi="Segoe UI Emoji" w:cs="Segoe UI Emoji"/>
-            </mc:Choice>
-            <mc:Fallback>
-              <w:rFonts w:ascii="Segoe UI Emoji" w:eastAsia="Segoe UI Emoji" w:hAnsi="Segoe UI Emoji" w:cs="Segoe UI Emoji"/>
-            </mc:Fallback>
-          </mc:AlternateContent>
-        </w:rPr>
-        <mc:AlternateContent>
-          <mc:Choice Requires="w16se">
-            <w16se:symEx w16se:font="Segoe UI Emoji" w16se:char="1F60A"/>
-          </mc:Choice>
-          <mc:Fallback>
-            <w:t>😊</w:t>
-          </mc:Fallback>
-        </mc:AlternateContent>
-      </w:r>
-    </w:p>
     <w:sectPr>
       <w:pgSz w:w="12240" w:h="15840"/>
       <w:pgMar w:top="1440" w:right="1440" w:bottom="1440" w:left="1440" w:header="720" w:footer="720" w:gutter="0"/>

</xml_diff>